<commit_message>
finalni verze, smazany zbytecne veci, okomentovano, splnena cast bonusu
</commit_message>
<xml_diff>
--- a/doc/PozadavkyPGRF1_Task1_2026.docx
+++ b/doc/PozadavkyPGRF1_Task1_2026.docx
@@ -298,27 +298,7 @@
                 <w:szCs w:val="24"/>
                 <w:lang w:eastAsia="cs-CZ"/>
               </w:rPr>
-              <w:t xml:space="preserve">Správná </w:t>
-            </w:r>
-            <w:proofErr w:type="spellStart"/>
-            <w:r>
-              <w:rPr>
-                <w:rFonts w:ascii="Arial" w:eastAsia="Times New Roman" w:hAnsi="Arial" w:cs="Arial"/>
-                <w:sz w:val="20"/>
-                <w:szCs w:val="24"/>
-                <w:lang w:eastAsia="cs-CZ"/>
-              </w:rPr>
-              <w:t>rasterizace</w:t>
-            </w:r>
-            <w:proofErr w:type="spellEnd"/>
-            <w:r>
-              <w:rPr>
-                <w:rFonts w:ascii="Arial" w:eastAsia="Times New Roman" w:hAnsi="Arial" w:cs="Arial"/>
-                <w:sz w:val="20"/>
-                <w:szCs w:val="24"/>
-                <w:lang w:eastAsia="cs-CZ"/>
-              </w:rPr>
-              <w:t xml:space="preserve"> ve všech kvadrantech</w:t>
+              <w:t>Správná rasterizace ve všech kvadrantech</w:t>
             </w:r>
             <w:r>
               <w:rPr>
@@ -350,6 +330,16 @@
                 <w:lang w:eastAsia="cs-CZ"/>
               </w:rPr>
             </w:pPr>
+            <w:r>
+              <w:rPr>
+                <w:rFonts w:ascii="Arial" w:eastAsia="Times New Roman" w:hAnsi="Arial" w:cs="Arial"/>
+                <w:sz w:val="20"/>
+                <w:szCs w:val="24"/>
+                <w:highlight w:val="yellow"/>
+                <w:lang w:eastAsia="cs-CZ"/>
+              </w:rPr>
+              <w:t>100%</w:t>
+            </w:r>
           </w:p>
         </w:tc>
         <w:tc>
@@ -371,6 +361,16 @@
                 <w:lang w:eastAsia="cs-CZ"/>
               </w:rPr>
             </w:pPr>
+            <w:r>
+              <w:rPr>
+                <w:rFonts w:ascii="Times New Roman" w:eastAsia="Times New Roman" w:hAnsi="Times New Roman" w:cs="Times New Roman"/>
+                <w:sz w:val="20"/>
+                <w:szCs w:val="20"/>
+                <w:highlight w:val="yellow"/>
+                <w:lang w:eastAsia="cs-CZ"/>
+              </w:rPr>
+              <w:t>L (přepnutí módu) +  levé tlačítko myši</w:t>
+            </w:r>
           </w:p>
         </w:tc>
         <w:tc>
@@ -389,6 +389,24 @@
                 <w:lang w:eastAsia="cs-CZ"/>
               </w:rPr>
             </w:pPr>
+            <w:r>
+              <w:rPr>
+                <w:rFonts w:ascii="Times New Roman" w:eastAsia="Times New Roman" w:hAnsi="Times New Roman" w:cs="Times New Roman"/>
+                <w:sz w:val="20"/>
+                <w:szCs w:val="20"/>
+                <w:lang w:val="en-GB" w:eastAsia="cs-CZ"/>
+              </w:rPr>
+              <w:t>Funguj</w:t>
+            </w:r>
+            <w:r>
+              <w:rPr>
+                <w:rFonts w:ascii="Times New Roman" w:eastAsia="Times New Roman" w:hAnsi="Times New Roman" w:cs="Times New Roman"/>
+                <w:sz w:val="20"/>
+                <w:szCs w:val="20"/>
+                <w:lang w:eastAsia="cs-CZ"/>
+              </w:rPr>
+              <w:t>e vykreslování úseček ve všech kvadrantech, všemi směry</w:t>
+            </w:r>
           </w:p>
         </w:tc>
       </w:tr>
@@ -440,19 +458,8 @@
                 <w:szCs w:val="24"/>
                 <w:lang w:eastAsia="cs-CZ"/>
               </w:rPr>
-              <w:t xml:space="preserve">Označení algoritmu </w:t>
-            </w:r>
-            <w:proofErr w:type="spellStart"/>
-            <w:r>
-              <w:rPr>
-                <w:rFonts w:ascii="Arial" w:eastAsia="Times New Roman" w:hAnsi="Arial" w:cs="Arial"/>
-                <w:sz w:val="20"/>
-                <w:szCs w:val="24"/>
-                <w:lang w:eastAsia="cs-CZ"/>
-              </w:rPr>
-              <w:t>rasterizace</w:t>
-            </w:r>
-            <w:proofErr w:type="spellEnd"/>
+              <w:t>Označení algoritmu rasterizace</w:t>
+            </w:r>
             <w:r>
               <w:rPr>
                 <w:rFonts w:ascii="Arial" w:eastAsia="Times New Roman" w:hAnsi="Arial" w:cs="Arial"/>
@@ -510,6 +517,16 @@
                 <w:lang w:eastAsia="cs-CZ"/>
               </w:rPr>
             </w:pPr>
+            <w:r>
+              <w:rPr>
+                <w:rFonts w:ascii="Arial" w:eastAsia="Times New Roman" w:hAnsi="Arial" w:cs="Arial"/>
+                <w:sz w:val="20"/>
+                <w:szCs w:val="24"/>
+                <w:highlight w:val="yellow"/>
+                <w:lang w:eastAsia="cs-CZ"/>
+              </w:rPr>
+              <w:t>100%</w:t>
+            </w:r>
           </w:p>
         </w:tc>
         <w:tc>
@@ -633,6 +650,16 @@
                 <w:lang w:eastAsia="cs-CZ"/>
               </w:rPr>
             </w:pPr>
+            <w:r>
+              <w:rPr>
+                <w:rFonts w:ascii="Arial" w:eastAsia="Times New Roman" w:hAnsi="Arial" w:cs="Arial"/>
+                <w:sz w:val="20"/>
+                <w:szCs w:val="24"/>
+                <w:highlight w:val="yellow"/>
+                <w:lang w:eastAsia="cs-CZ"/>
+              </w:rPr>
+              <w:t>100%</w:t>
+            </w:r>
           </w:p>
         </w:tc>
         <w:tc>
@@ -654,6 +681,16 @@
                 <w:lang w:eastAsia="cs-CZ"/>
               </w:rPr>
             </w:pPr>
+            <w:r>
+              <w:rPr>
+                <w:rFonts w:ascii="Times New Roman" w:eastAsia="Times New Roman" w:hAnsi="Times New Roman" w:cs="Times New Roman"/>
+                <w:sz w:val="20"/>
+                <w:szCs w:val="20"/>
+                <w:highlight w:val="yellow"/>
+                <w:lang w:eastAsia="cs-CZ"/>
+              </w:rPr>
+              <w:t>Puštění levého tlačítka myši</w:t>
+            </w:r>
           </w:p>
         </w:tc>
         <w:tc>
@@ -752,6 +789,16 @@
                 <w:lang w:eastAsia="cs-CZ"/>
               </w:rPr>
             </w:pPr>
+            <w:r>
+              <w:rPr>
+                <w:rFonts w:ascii="Arial" w:eastAsia="Times New Roman" w:hAnsi="Arial" w:cs="Arial"/>
+                <w:sz w:val="20"/>
+                <w:szCs w:val="24"/>
+                <w:highlight w:val="yellow"/>
+                <w:lang w:eastAsia="cs-CZ"/>
+              </w:rPr>
+              <w:t>100%</w:t>
+            </w:r>
           </w:p>
         </w:tc>
         <w:tc>
@@ -789,6 +836,15 @@
                 <w:lang w:eastAsia="cs-CZ"/>
               </w:rPr>
             </w:pPr>
+            <w:r>
+              <w:rPr>
+                <w:rFonts w:ascii="Times New Roman" w:eastAsia="Times New Roman" w:hAnsi="Times New Roman" w:cs="Times New Roman"/>
+                <w:sz w:val="20"/>
+                <w:szCs w:val="20"/>
+                <w:lang w:eastAsia="cs-CZ"/>
+              </w:rPr>
+              <w:t>Při tažení se opakovaně překresluje celá scéna a tento náhled se neukládá</w:t>
+            </w:r>
           </w:p>
         </w:tc>
       </w:tr>
@@ -861,6 +917,16 @@
                 <w:lang w:eastAsia="cs-CZ"/>
               </w:rPr>
             </w:pPr>
+            <w:r>
+              <w:rPr>
+                <w:rFonts w:ascii="Arial" w:eastAsia="Times New Roman" w:hAnsi="Arial" w:cs="Arial"/>
+                <w:sz w:val="20"/>
+                <w:szCs w:val="24"/>
+                <w:highlight w:val="yellow"/>
+                <w:lang w:eastAsia="cs-CZ"/>
+              </w:rPr>
+              <w:t>100%</w:t>
+            </w:r>
           </w:p>
         </w:tc>
         <w:tc>
@@ -898,6 +964,15 @@
                 <w:lang w:eastAsia="cs-CZ"/>
               </w:rPr>
             </w:pPr>
+            <w:r>
+              <w:rPr>
+                <w:rFonts w:ascii="Times New Roman" w:eastAsia="Times New Roman" w:hAnsi="Times New Roman" w:cs="Times New Roman"/>
+                <w:sz w:val="20"/>
+                <w:szCs w:val="20"/>
+                <w:lang w:eastAsia="cs-CZ"/>
+              </w:rPr>
+              <w:t>LineRasterizer je předkem LineRasterizerTrivial, použito z cvičení</w:t>
+            </w:r>
           </w:p>
         </w:tc>
       </w:tr>
@@ -982,6 +1057,16 @@
                 <w:lang w:eastAsia="cs-CZ"/>
               </w:rPr>
             </w:pPr>
+            <w:r>
+              <w:rPr>
+                <w:rFonts w:ascii="Arial" w:eastAsia="Times New Roman" w:hAnsi="Arial" w:cs="Arial"/>
+                <w:sz w:val="20"/>
+                <w:szCs w:val="24"/>
+                <w:highlight w:val="yellow"/>
+                <w:lang w:eastAsia="cs-CZ"/>
+              </w:rPr>
+              <w:t>100%</w:t>
+            </w:r>
           </w:p>
         </w:tc>
         <w:tc>
@@ -1021,6 +1106,15 @@
                 <w:lang w:eastAsia="cs-CZ"/>
               </w:rPr>
             </w:pPr>
+            <w:r>
+              <w:rPr>
+                <w:rFonts w:ascii="Times New Roman" w:eastAsia="Times New Roman" w:hAnsi="Times New Roman" w:cs="Times New Roman"/>
+                <w:sz w:val="20"/>
+                <w:szCs w:val="20"/>
+                <w:lang w:eastAsia="cs-CZ"/>
+              </w:rPr>
+              <w:t>V třídě Polygon je private final List, kde jsou uloženy metody. Dá se upravovat pouze skrz metody třídy Polygon</w:t>
+            </w:r>
           </w:p>
         </w:tc>
       </w:tr>
@@ -1093,6 +1187,16 @@
                 <w:lang w:eastAsia="cs-CZ"/>
               </w:rPr>
             </w:pPr>
+            <w:r>
+              <w:rPr>
+                <w:rFonts w:ascii="Arial" w:eastAsia="Times New Roman" w:hAnsi="Arial" w:cs="Arial"/>
+                <w:sz w:val="20"/>
+                <w:szCs w:val="24"/>
+                <w:highlight w:val="yellow"/>
+                <w:lang w:eastAsia="cs-CZ"/>
+              </w:rPr>
+              <w:t>100%</w:t>
+            </w:r>
           </w:p>
         </w:tc>
         <w:tc>
@@ -1113,6 +1217,46 @@
                 <w:lang w:eastAsia="cs-CZ"/>
               </w:rPr>
             </w:pPr>
+            <w:r>
+              <w:rPr>
+                <w:rFonts w:ascii="Arial" w:eastAsia="Times New Roman" w:hAnsi="Arial" w:cs="Arial"/>
+                <w:sz w:val="20"/>
+                <w:szCs w:val="24"/>
+                <w:highlight w:val="yellow"/>
+                <w:lang w:val="en-GB" w:eastAsia="cs-CZ"/>
+              </w:rPr>
+              <w:t>P (p</w:t>
+            </w:r>
+            <w:r>
+              <w:rPr>
+                <w:rFonts w:ascii="Arial" w:eastAsia="Times New Roman" w:hAnsi="Arial" w:cs="Arial"/>
+                <w:sz w:val="20"/>
+                <w:szCs w:val="24"/>
+                <w:highlight w:val="yellow"/>
+                <w:lang w:eastAsia="cs-CZ"/>
+              </w:rPr>
+              <w:t>řepnutí módu) +</w:t>
+            </w:r>
+            <w:r>
+              <w:rPr>
+                <w:rFonts w:ascii="Arial" w:eastAsia="Times New Roman" w:hAnsi="Arial" w:cs="Arial"/>
+                <w:sz w:val="20"/>
+                <w:szCs w:val="24"/>
+                <w:highlight w:val="yellow"/>
+                <w:lang w:val="en-GB" w:eastAsia="cs-CZ"/>
+              </w:rPr>
+              <w:t xml:space="preserve"> lev</w:t>
+            </w:r>
+            <w:r>
+              <w:rPr>
+                <w:rFonts w:ascii="Arial" w:eastAsia="Times New Roman" w:hAnsi="Arial" w:cs="Arial"/>
+                <w:sz w:val="20"/>
+                <w:szCs w:val="24"/>
+                <w:highlight w:val="yellow"/>
+                <w:lang w:eastAsia="cs-CZ"/>
+              </w:rPr>
+              <w:t>é tlačítko myši</w:t>
+            </w:r>
           </w:p>
         </w:tc>
         <w:tc>
@@ -1201,6 +1345,16 @@
                 <w:lang w:eastAsia="cs-CZ"/>
               </w:rPr>
             </w:pPr>
+            <w:r>
+              <w:rPr>
+                <w:rFonts w:ascii="Arial" w:eastAsia="Times New Roman" w:hAnsi="Arial" w:cs="Arial"/>
+                <w:sz w:val="20"/>
+                <w:szCs w:val="24"/>
+                <w:highlight w:val="yellow"/>
+                <w:lang w:eastAsia="cs-CZ"/>
+              </w:rPr>
+              <w:t>100%</w:t>
+            </w:r>
           </w:p>
         </w:tc>
         <w:tc>
@@ -1238,6 +1392,15 @@
                 <w:lang w:eastAsia="cs-CZ"/>
               </w:rPr>
             </w:pPr>
+            <w:r>
+              <w:rPr>
+                <w:rFonts w:ascii="Times New Roman" w:eastAsia="Times New Roman" w:hAnsi="Times New Roman" w:cs="Times New Roman"/>
+                <w:sz w:val="20"/>
+                <w:szCs w:val="20"/>
+                <w:lang w:eastAsia="cs-CZ"/>
+              </w:rPr>
+              <w:t>Nový vrchol se vždy spojí s prvním a posledním vrcholem</w:t>
+            </w:r>
           </w:p>
         </w:tc>
       </w:tr>
@@ -1296,6 +1459,16 @@
                 <w:lang w:eastAsia="cs-CZ"/>
               </w:rPr>
             </w:pPr>
+            <w:r>
+              <w:rPr>
+                <w:rFonts w:ascii="Times New Roman" w:eastAsia="Times New Roman" w:hAnsi="Times New Roman" w:cs="Times New Roman"/>
+                <w:sz w:val="20"/>
+                <w:szCs w:val="20"/>
+                <w:highlight w:val="yellow"/>
+                <w:lang w:eastAsia="cs-CZ"/>
+              </w:rPr>
+              <w:t>100%</w:t>
+            </w:r>
           </w:p>
         </w:tc>
         <w:tc>
@@ -1317,6 +1490,16 @@
                 <w:lang w:eastAsia="cs-CZ"/>
               </w:rPr>
             </w:pPr>
+            <w:r>
+              <w:rPr>
+                <w:rFonts w:ascii="Times New Roman" w:eastAsia="Times New Roman" w:hAnsi="Times New Roman" w:cs="Times New Roman"/>
+                <w:sz w:val="20"/>
+                <w:szCs w:val="20"/>
+                <w:highlight w:val="yellow"/>
+                <w:lang w:eastAsia="cs-CZ"/>
+              </w:rPr>
+              <w:t>C</w:t>
+            </w:r>
           </w:p>
         </w:tc>
         <w:tc>
@@ -1414,6 +1597,15 @@
                 <w:lang w:eastAsia="cs-CZ"/>
               </w:rPr>
             </w:pPr>
+            <w:r>
+              <w:rPr>
+                <w:rFonts w:ascii="Arial" w:eastAsia="Times New Roman" w:hAnsi="Arial" w:cs="Arial"/>
+                <w:sz w:val="20"/>
+                <w:szCs w:val="24"/>
+                <w:lang w:eastAsia="cs-CZ"/>
+              </w:rPr>
+              <w:t>100%</w:t>
+            </w:r>
           </w:p>
         </w:tc>
         <w:tc>
@@ -1434,6 +1626,51 @@
                 <w:lang w:eastAsia="cs-CZ"/>
               </w:rPr>
             </w:pPr>
+            <w:r>
+              <w:rPr>
+                <w:rFonts w:ascii="Times New Roman" w:eastAsia="Times New Roman" w:hAnsi="Times New Roman" w:cs="Times New Roman"/>
+                <w:sz w:val="20"/>
+                <w:szCs w:val="20"/>
+                <w:lang w:eastAsia="cs-CZ"/>
+              </w:rPr>
+              <w:t>E (</w:t>
+            </w:r>
+            <w:r>
+              <w:rPr>
+                <w:rFonts w:ascii="Times New Roman" w:eastAsia="Times New Roman" w:hAnsi="Times New Roman" w:cs="Times New Roman"/>
+                <w:sz w:val="20"/>
+                <w:szCs w:val="20"/>
+                <w:lang w:val="en-GB" w:eastAsia="cs-CZ"/>
+              </w:rPr>
+              <w:t>p</w:t>
+            </w:r>
+            <w:r>
+              <w:rPr>
+                <w:rFonts w:ascii="Times New Roman" w:eastAsia="Times New Roman" w:hAnsi="Times New Roman" w:cs="Times New Roman"/>
+                <w:sz w:val="20"/>
+                <w:szCs w:val="20"/>
+                <w:lang w:eastAsia="cs-CZ"/>
+              </w:rPr>
+              <w:t>řepnutí módu) +</w:t>
+            </w:r>
+            <w:r>
+              <w:rPr>
+                <w:rFonts w:ascii="Times New Roman" w:eastAsia="Times New Roman" w:hAnsi="Times New Roman" w:cs="Times New Roman"/>
+                <w:sz w:val="20"/>
+                <w:szCs w:val="20"/>
+                <w:lang w:val="en-GB" w:eastAsia="cs-CZ"/>
+              </w:rPr>
+              <w:t>prav</w:t>
+            </w:r>
+            <w:r>
+              <w:rPr>
+                <w:rFonts w:ascii="Times New Roman" w:eastAsia="Times New Roman" w:hAnsi="Times New Roman" w:cs="Times New Roman"/>
+                <w:sz w:val="20"/>
+                <w:szCs w:val="20"/>
+                <w:lang w:eastAsia="cs-CZ"/>
+              </w:rPr>
+              <w:t>é tlačítko myši</w:t>
+            </w:r>
           </w:p>
         </w:tc>
         <w:tc>
@@ -1523,6 +1760,15 @@
                 <w:lang w:eastAsia="cs-CZ"/>
               </w:rPr>
             </w:pPr>
+            <w:r>
+              <w:rPr>
+                <w:rFonts w:ascii="Arial" w:eastAsia="Times New Roman" w:hAnsi="Arial" w:cs="Arial"/>
+                <w:sz w:val="20"/>
+                <w:szCs w:val="24"/>
+                <w:lang w:eastAsia="cs-CZ"/>
+              </w:rPr>
+              <w:t>100%</w:t>
+            </w:r>
           </w:p>
         </w:tc>
         <w:tc>
@@ -1543,6 +1789,15 @@
                 <w:lang w:eastAsia="cs-CZ"/>
               </w:rPr>
             </w:pPr>
+            <w:r>
+              <w:rPr>
+                <w:rFonts w:ascii="Times New Roman" w:eastAsia="Times New Roman" w:hAnsi="Times New Roman" w:cs="Times New Roman"/>
+                <w:sz w:val="20"/>
+                <w:szCs w:val="20"/>
+                <w:lang w:eastAsia="cs-CZ"/>
+              </w:rPr>
+              <w:t>E (přepnutí módu) + držet Shift a kliknout pravým tlačítkem myši u vrcholu který chceme smazat</w:t>
+            </w:r>
           </w:p>
         </w:tc>
         <w:tc>
@@ -1631,6 +1886,15 @@
                 <w:lang w:eastAsia="cs-CZ"/>
               </w:rPr>
             </w:pPr>
+            <w:r>
+              <w:rPr>
+                <w:rFonts w:ascii="Arial" w:eastAsia="Times New Roman" w:hAnsi="Arial" w:cs="Arial"/>
+                <w:sz w:val="20"/>
+                <w:szCs w:val="24"/>
+                <w:lang w:eastAsia="cs-CZ"/>
+              </w:rPr>
+              <w:t>0%</w:t>
+            </w:r>
           </w:p>
         </w:tc>
         <w:tc>
@@ -1642,7 +1906,6 @@
           </w:tcPr>
           <w:p>
             <w:pPr>
-              <w:jc w:val="center"/>
               <w:cnfStyle w:val="000000000000" w:firstRow="0" w:lastRow="0" w:firstColumn="0" w:lastColumn="0" w:oddVBand="0" w:evenVBand="0" w:oddHBand="0" w:evenHBand="0" w:firstRowFirstColumn="0" w:firstRowLastColumn="0" w:lastRowFirstColumn="0" w:lastRowLastColumn="0"/>
               <w:rPr>
                 <w:rFonts w:ascii="Times New Roman" w:eastAsia="Times New Roman" w:hAnsi="Times New Roman" w:cs="Times New Roman"/>
@@ -1710,45 +1973,14 @@
                 <w:lang w:eastAsia="cs-CZ"/>
               </w:rPr>
             </w:pPr>
-            <w:proofErr w:type="spellStart"/>
-            <w:r>
-              <w:rPr>
-                <w:rFonts w:ascii="Arial" w:eastAsia="Times New Roman" w:hAnsi="Arial" w:cs="Arial"/>
-                <w:sz w:val="20"/>
-                <w:szCs w:val="24"/>
-                <w:lang w:eastAsia="cs-CZ"/>
-              </w:rPr>
-              <w:t>GITový</w:t>
-            </w:r>
-            <w:proofErr w:type="spellEnd"/>
-            <w:r>
-              <w:rPr>
-                <w:rFonts w:ascii="Arial" w:eastAsia="Times New Roman" w:hAnsi="Arial" w:cs="Arial"/>
-                <w:sz w:val="20"/>
-                <w:szCs w:val="24"/>
-                <w:lang w:eastAsia="cs-CZ"/>
-              </w:rPr>
-              <w:t xml:space="preserve"> </w:t>
-            </w:r>
-            <w:proofErr w:type="spellStart"/>
-            <w:r>
-              <w:rPr>
-                <w:rFonts w:ascii="Arial" w:eastAsia="Times New Roman" w:hAnsi="Arial" w:cs="Arial"/>
-                <w:sz w:val="20"/>
-                <w:szCs w:val="24"/>
-                <w:lang w:eastAsia="cs-CZ"/>
-              </w:rPr>
-              <w:t>repozitář</w:t>
-            </w:r>
-            <w:proofErr w:type="spellEnd"/>
-            <w:r>
-              <w:rPr>
-                <w:rFonts w:ascii="Arial" w:eastAsia="Times New Roman" w:hAnsi="Arial" w:cs="Arial"/>
-                <w:sz w:val="20"/>
-                <w:szCs w:val="24"/>
-                <w:lang w:eastAsia="cs-CZ"/>
-              </w:rPr>
-              <w:t xml:space="preserve"> s výsledným kódem</w:t>
+            <w:r>
+              <w:rPr>
+                <w:rFonts w:ascii="Arial" w:eastAsia="Times New Roman" w:hAnsi="Arial" w:cs="Arial"/>
+                <w:sz w:val="20"/>
+                <w:szCs w:val="24"/>
+                <w:lang w:eastAsia="cs-CZ"/>
+              </w:rPr>
+              <w:t>GITový repozitář s výsledným kódem</w:t>
             </w:r>
             <w:r>
               <w:rPr>
@@ -1758,19 +1990,8 @@
                 <w:lang w:eastAsia="cs-CZ"/>
               </w:rPr>
               <w:br/>
-              <w:t xml:space="preserve">Prosím uveďte link na </w:t>
-            </w:r>
-            <w:proofErr w:type="spellStart"/>
-            <w:r>
-              <w:rPr>
-                <w:rFonts w:ascii="Arial" w:eastAsia="Times New Roman" w:hAnsi="Arial" w:cs="Arial"/>
-                <w:sz w:val="20"/>
-                <w:szCs w:val="24"/>
-                <w:lang w:eastAsia="cs-CZ"/>
-              </w:rPr>
-              <w:t>repozitář</w:t>
-            </w:r>
-            <w:proofErr w:type="spellEnd"/>
+              <w:t>Prosím uveďte link na repozitář</w:t>
+            </w:r>
           </w:p>
         </w:tc>
         <w:tc>
@@ -1790,6 +2011,15 @@
                 <w:lang w:eastAsia="cs-CZ"/>
               </w:rPr>
             </w:pPr>
+            <w:r>
+              <w:rPr>
+                <w:rFonts w:ascii="Arial" w:eastAsia="Times New Roman" w:hAnsi="Arial" w:cs="Arial"/>
+                <w:sz w:val="20"/>
+                <w:szCs w:val="24"/>
+                <w:lang w:eastAsia="cs-CZ"/>
+              </w:rPr>
+              <w:t>100%</w:t>
+            </w:r>
           </w:p>
         </w:tc>
         <w:tc>
@@ -1826,6 +2056,15 @@
                 <w:lang w:eastAsia="cs-CZ"/>
               </w:rPr>
             </w:pPr>
+            <w:r>
+              <w:rPr>
+                <w:rFonts w:ascii="Times New Roman" w:eastAsia="Times New Roman" w:hAnsi="Times New Roman" w:cs="Times New Roman"/>
+                <w:sz w:val="20"/>
+                <w:szCs w:val="20"/>
+                <w:lang w:eastAsia="cs-CZ"/>
+              </w:rPr>
+              <w:t>https://github.com/kcharvatova/c01_charvatova_katerina</w:t>
+            </w:r>
           </w:p>
         </w:tc>
       </w:tr>
@@ -2371,6 +2610,33 @@
                 <w:lang w:eastAsia="cs-CZ"/>
               </w:rPr>
             </w:pPr>
+            <w:r>
+              <w:rPr>
+                <w:rFonts w:ascii="Times New Roman" w:eastAsia="Times New Roman" w:hAnsi="Times New Roman" w:cs="Times New Roman"/>
+                <w:sz w:val="20"/>
+                <w:szCs w:val="20"/>
+                <w:lang w:eastAsia="cs-CZ"/>
+              </w:rPr>
+              <w:t>Při práci jsem používala Claude, primárně když jsem nemohla vymyslet matematický postup/</w:t>
+            </w:r>
+            <w:r>
+              <w:rPr>
+                <w:rFonts w:ascii="Times New Roman" w:eastAsia="Times New Roman" w:hAnsi="Times New Roman" w:cs="Times New Roman"/>
+                <w:sz w:val="20"/>
+                <w:szCs w:val="20"/>
+                <w:lang w:val="en-GB" w:eastAsia="cs-CZ"/>
+              </w:rPr>
+              <w:t>vhodn</w:t>
+            </w:r>
+            <w:r>
+              <w:rPr>
+                <w:rFonts w:ascii="Times New Roman" w:eastAsia="Times New Roman" w:hAnsi="Times New Roman" w:cs="Times New Roman"/>
+                <w:sz w:val="20"/>
+                <w:szCs w:val="20"/>
+                <w:lang w:eastAsia="cs-CZ"/>
+              </w:rPr>
+              <w:t>ě ho převést do kódu. Také s metodou drawScene, kam jsem se snažila dostat „pružné čáry“.</w:t>
+            </w:r>
           </w:p>
         </w:tc>
       </w:tr>

</xml_diff>